<commit_message>
feat: adiciona análise RQ09 de PRs e releases
</commit_message>
<xml_diff>
--- a/Sprint1/docs/Relatorio_Parcial_Lab01S03.docx
+++ b/Sprint1/docs/Relatorio_Parcial_Lab01S03.docx
@@ -37,7 +37,7 @@
         <w:rPr>
           <w:sz w:val="24"/>
         </w:rPr>
-        <w:t>Lab01S03 — versão intermediária com RQ01–RQ08 e RQ10</w:t>
+        <w:t>Lab01S03 — versão intermediária com RQ01–RQ10</w:t>
       </w:r>
     </w:p>
     <w:tbl>
@@ -226,7 +226,7 @@
               <w:rPr>
                 <w:sz w:val="19"/>
               </w:rPr>
-              <w:t>Pedro Henrique Maia Alves; Diogo C. Brunoro; [TERCEIRO INTEGRANTE — EDITAR]</w:t>
+              <w:t>Pedro Henrique Maia Alves; Diogo C. Brunoro; Lorran Pedro Avelar Xavier</w:t>
             </w:r>
           </w:p>
         </w:tc>
@@ -262,7 +262,7 @@
               <w:rPr>
                 <w:sz w:val="19"/>
               </w:rPr>
-              <w:t>Relatório intermediário; RQ09 e snapshot final do board pendentes</w:t>
+              <w:t>RQ01–RQ10 integradas; snapshot final do board pendente</w:t>
             </w:r>
           </w:p>
         </w:tc>
@@ -319,6 +319,8 @@
     <w:p>
       <w:pPr>
         <w:sectPr>
+          <w:headerReference w:type="default" r:id="rId8"/>
+          <w:footerReference w:type="default" r:id="rId9"/>
           <w:pgSz w:w="12240" w:h="15840"/>
           <w:pgMar w:top="1134" w:right="1417" w:bottom="1134" w:left="1417" w:header="720" w:footer="720" w:gutter="0"/>
           <w:cols w:space="720"/>
@@ -347,7 +349,7 @@
         <w:jc w:val="both"/>
       </w:pPr>
       <w:r>
-        <w:t>Esta é a versão intermediária da sprint S03. Ela consolida os resultados atualizados das sete questões sugeridas pelo professor e incorpora a RQ08, sobre popularidade e intensidade anual de desenvolvimento, e a RQ10, sobre maturidade e tratamento de issues. A aplicação Streamlit integra mineração, análise, visualização e exportação do CSV.</w:t>
+        <w:t>Esta é a versão intermediária da sprint S03. Ela consolida os resultados atualizados das sete questões sugeridas pelo professor e incorpora a RQ08, sobre popularidade e intensidade anual de desenvolvimento, a RQ09, sobre colaboração e publicação de releases, e a RQ10, sobre maturidade e tratamento de issues. A aplicação Streamlit integra mineração, análise, visualização e exportação do CSV.</w:t>
       </w:r>
     </w:p>
     <w:p>
@@ -881,6 +883,59 @@
               <w:rPr>
                 <w:sz w:val="16"/>
               </w:rPr>
+              <w:t>RQ09</w:t>
+            </w:r>
+          </w:p>
+        </w:tc>
+        <w:tc>
+          <w:tcPr>
+            <w:tcW w:type="dxa" w:w="3135"/>
+            <w:vAlign w:val="center"/>
+          </w:tcPr>
+          <w:p>
+            <w:pPr>
+              <w:jc w:val="center"/>
+            </w:pPr>
+            <w:r>
+              <w:rPr>
+                <w:sz w:val="16"/>
+              </w:rPr>
+              <w:t>Maior intensidade de PRs está associada a maior intensidade de releases?</w:t>
+            </w:r>
+          </w:p>
+        </w:tc>
+        <w:tc>
+          <w:tcPr>
+            <w:tcW w:type="dxa" w:w="3135"/>
+            <w:vAlign w:val="center"/>
+          </w:tcPr>
+          <w:p>
+            <w:pPr>
+              <w:jc w:val="center"/>
+            </w:pPr>
+            <w:r>
+              <w:rPr>
+                <w:sz w:val="16"/>
+              </w:rPr>
+              <w:t>H09: espera-se associação positiva entre PRs mescladas/ano e releases/ano.</w:t>
+            </w:r>
+          </w:p>
+        </w:tc>
+      </w:tr>
+      <w:tr>
+        <w:tc>
+          <w:tcPr>
+            <w:tcW w:type="dxa" w:w="3135"/>
+            <w:vAlign w:val="center"/>
+          </w:tcPr>
+          <w:p>
+            <w:pPr>
+              <w:jc w:val="left"/>
+            </w:pPr>
+            <w:r>
+              <w:rPr>
+                <w:sz w:val="16"/>
+              </w:rPr>
               <w:t>RQ10</w:t>
             </w:r>
           </w:p>
@@ -951,7 +1006,7 @@
         <w:jc w:val="both"/>
       </w:pPr>
       <w:r>
-        <w:t>Na S03, a Issue #44 incorporou a RQ08 com taxas anualizadas, correlações, quartis e visualizações. A Issue #46 acrescentou a RQ10, relacionando idade e percentual de issues fechadas por correlação de Spearman e faixas etárias. A Issue #47 evoluiu a exibição e a busca dos dados no Streamlit. Permanecem pendentes a RQ09 e o print final do board.</w:t>
+        <w:t>Na S03, a Issue #44 incorporou a RQ08 com taxas anualizadas, correlações, quartis e visualizações. A Issue #45 acrescentou a RQ09, relacionando PRs mescladas/ano e releases/ano. A Issue #46 incorporou a RQ10 sobre idade e percentual de issues fechadas, e a Issue #47 evoluiu a exibição e a busca no Streamlit. O snapshot final do board permanece pendente até a conclusão do trabalho.</w:t>
       </w:r>
     </w:p>
     <w:tbl>
@@ -1240,7 +1295,7 @@
               <w:rPr>
                 <w:sz w:val="16"/>
               </w:rPr>
-              <w:t>[TERCEIRO INTEGRANTE — EDITAR]</w:t>
+              <w:t>Pedro Henrique Maia Alves</w:t>
             </w:r>
           </w:p>
         </w:tc>
@@ -1310,7 +1365,7 @@
               <w:rPr>
                 <w:sz w:val="16"/>
               </w:rPr>
-              <w:t>Pendente</w:t>
+              <w:t>Lorran Pedro Avelar Xavier</w:t>
             </w:r>
           </w:p>
         </w:tc>
@@ -1503,7 +1558,7 @@
         <w:pStyle w:val="Commarcadores"/>
       </w:pPr>
       <w:r>
-        <w:t>analysis contém módulos independentes de RQ01 a RQ08 e RQ10 e exporta nove JSONs estritos;</w:t>
+        <w:t>analysis contém módulos independentes de RQ01 a RQ10 e exporta dez JSONs estritos;</w:t>
       </w:r>
     </w:p>
     <w:p>
@@ -1511,7 +1566,7 @@
         <w:pStyle w:val="Commarcadores"/>
       </w:pPr>
       <w:r>
-        <w:t>app.py apresenta abas para RQ01–RQ08 e RQ10, busca por repositório e download do CSV com as taxas da RQ08;</w:t>
+        <w:t>app.py apresenta abas para RQ01–RQ10, busca por repositório e download do CSV com as taxas e correlações anualizadas;</w:t>
       </w:r>
     </w:p>
     <w:p>
@@ -1535,7 +1590,7 @@
         <w:jc w:val="both"/>
       </w:pPr>
       <w:r>
-        <w:t>A inovação do grupo é uma aplicação interativa em Streamlit. A versão atual apresenta a RQ08 com coeficientes, quartis, sensibilidade e gráficos de dispersão, além da RQ10 com a relação entre idade e fechamento de issues. Os tooltips preservam os valores originais; estrelas usam escala logarítmica e as taxas anualizadas usam symlog, mantendo observações iguais a zero.</w:t>
+        <w:t>A inovação do grupo é uma aplicação interativa em Streamlit. A versão atual apresenta a RQ08 com coeficientes, quartis, sensibilidade e gráficos de dispersão, a RQ09 com correlação, quartis de PRs, tendência e identificação de outliers, além da RQ10 com a relação entre idade e fechamento de issues. Os tooltips preservam os valores originais e as taxas anualizadas usam symlog, mantendo observações iguais a zero.</w:t>
       </w:r>
     </w:p>
     <w:p>
@@ -1936,6 +1991,42 @@
               <w:rPr>
                 <w:sz w:val="16"/>
               </w:rPr>
+              <w:t>RQ09</w:t>
+            </w:r>
+          </w:p>
+        </w:tc>
+        <w:tc>
+          <w:tcPr>
+            <w:tcW w:type="dxa" w:w="4703"/>
+            <w:vAlign w:val="center"/>
+          </w:tcPr>
+          <w:p>
+            <w:pPr>
+              <w:jc w:val="center"/>
+            </w:pPr>
+            <w:r>
+              <w:rPr>
+                <w:sz w:val="16"/>
+              </w:rPr>
+              <w:t>Spearman entre PRs mescladas/ano e releases/ano; medianas por quartil de PRs</w:t>
+            </w:r>
+          </w:p>
+        </w:tc>
+      </w:tr>
+      <w:tr>
+        <w:tc>
+          <w:tcPr>
+            <w:tcW w:type="dxa" w:w="4703"/>
+            <w:vAlign w:val="center"/>
+          </w:tcPr>
+          <w:p>
+            <w:pPr>
+              <w:jc w:val="left"/>
+            </w:pPr>
+            <w:r>
+              <w:rPr>
+                <w:sz w:val="16"/>
+              </w:rPr>
               <w:t>RQ10</w:t>
             </w:r>
           </w:p>
@@ -1997,7 +2088,31 @@
         <w:pStyle w:val="Ttulo2"/>
       </w:pPr>
       <w:r>
-        <w:t>3.4 Procedimento analítico da RQ10</w:t>
+        <w:t>3.4 Procedimento analítico da RQ09</w:t>
+      </w:r>
+    </w:p>
+    <w:p>
+      <w:pPr>
+        <w:jc w:val="both"/>
+      </w:pPr>
+      <w:r>
+        <w:t>A RQ09 usa os 917 repositórios com idade ≥ 1 ano. PRs mescladas e releases acumuladas são divididas pela idade registrada no CSV, com quatro casas decimais. Spearman é calculado entre as duas taxas usando postos médios; os quartis são formados após ordenação estável por PRs/ano e nome.</w:t>
+      </w:r>
+    </w:p>
+    <w:p>
+      <w:pPr>
+        <w:jc w:val="both"/>
+      </w:pPr>
+      <w:r>
+        <w:t>Outliers são identificados separadamente nas duas taxas pelo critério de 1,5 × IQR e mantidos na correlação e nos quartis. A linha de tendência é uma regressão linear descritiva sobre as taxas anualizadas e não substitui a associação monotônica de Spearman.</w:t>
+      </w:r>
+    </w:p>
+    <w:p>
+      <w:pPr>
+        <w:pStyle w:val="Ttulo2"/>
+      </w:pPr>
+      <w:r>
+        <w:t>3.5 Procedimento analítico da RQ10</w:t>
       </w:r>
     </w:p>
     <w:p>
@@ -2045,7 +2160,7 @@
         <w:jc w:val="both"/>
       </w:pPr>
       <w:r>
-        <w:t>O snapshot contém 1.000 linhas, 1.000 nomes e 1.000 URLs únicas. As estrelas estão em ordem não crescente. O CSV contém as taxas PRs por ano e Releases por ano, e os nove arquivos JSON de RQ01–RQ08 e RQ10 registram total_repositorios = 1.000.</w:t>
+        <w:t>O snapshot contém 1.000 linhas, 1.000 nomes e 1.000 URLs únicas. As estrelas estão em ordem não crescente. O CSV contém as taxas PRs por ano e Releases por ano, e os dez arquivos JSON de RQ01–RQ10 registram total_repositorios = 1.000.</w:t>
       </w:r>
     </w:p>
     <w:p>
@@ -2079,7 +2194,7 @@
       <w:r>
         <w:drawing>
           <wp:inline xmlns:a="http://schemas.openxmlformats.org/drawingml/2006/main" xmlns:pic="http://schemas.openxmlformats.org/drawingml/2006/picture">
-            <wp:extent cx="5688000" cy="3087227"/>
+            <wp:extent cx="5688000" cy="3090406"/>
             <wp:docPr id="1" name="Picture 1"/>
             <wp:cNvGraphicFramePr>
               <a:graphicFrameLocks noChangeAspect="1"/>
@@ -2092,7 +2207,7 @@
                     <pic:cNvPicPr/>
                   </pic:nvPicPr>
                   <pic:blipFill>
-                    <a:blip r:embed="rId10"/>
+                    <a:blip r:embed="rId21"/>
                     <a:stretch>
                       <a:fillRect/>
                     </a:stretch>
@@ -2100,7 +2215,7 @@
                   <pic:spPr>
                     <a:xfrm>
                       <a:off x="0" y="0"/>
-                      <a:ext cx="5688000" cy="3087227"/>
+                      <a:ext cx="5688000" cy="3090406"/>
                     </a:xfrm>
                     <a:prstGeom prst="rect"/>
                   </pic:spPr>
@@ -2345,7 +2460,7 @@
                     <pic:cNvPicPr/>
                   </pic:nvPicPr>
                   <pic:blipFill>
-                    <a:blip r:embed="rId11"/>
+                    <a:blip r:embed="rId22"/>
                     <a:stretch>
                       <a:fillRect/>
                     </a:stretch>
@@ -2577,7 +2692,7 @@
       <w:r>
         <w:drawing>
           <wp:inline xmlns:a="http://schemas.openxmlformats.org/drawingml/2006/main" xmlns:pic="http://schemas.openxmlformats.org/drawingml/2006/picture">
-            <wp:extent cx="5688000" cy="3081388"/>
+            <wp:extent cx="5688000" cy="3084491"/>
             <wp:docPr id="3" name="Picture 3"/>
             <wp:cNvGraphicFramePr>
               <a:graphicFrameLocks noChangeAspect="1"/>
@@ -2590,7 +2705,7 @@
                     <pic:cNvPicPr/>
                   </pic:nvPicPr>
                   <pic:blipFill>
-                    <a:blip r:embed="rId12"/>
+                    <a:blip r:embed="rId23"/>
                     <a:stretch>
                       <a:fillRect/>
                     </a:stretch>
@@ -2598,7 +2713,7 @@
                   <pic:spPr>
                     <a:xfrm>
                       <a:off x="0" y="0"/>
-                      <a:ext cx="5688000" cy="3081388"/>
+                      <a:ext cx="5688000" cy="3084491"/>
                     </a:xfrm>
                     <a:prstGeom prst="rect"/>
                   </pic:spPr>
@@ -2894,7 +3009,7 @@
       <w:r>
         <w:drawing>
           <wp:inline xmlns:a="http://schemas.openxmlformats.org/drawingml/2006/main" xmlns:pic="http://schemas.openxmlformats.org/drawingml/2006/picture">
-            <wp:extent cx="5688000" cy="3150815"/>
+            <wp:extent cx="5688000" cy="3160353"/>
             <wp:docPr id="4" name="Picture 4"/>
             <wp:cNvGraphicFramePr>
               <a:graphicFrameLocks noChangeAspect="1"/>
@@ -2907,7 +3022,7 @@
                     <pic:cNvPicPr/>
                   </pic:nvPicPr>
                   <pic:blipFill>
-                    <a:blip r:embed="rId13"/>
+                    <a:blip r:embed="rId24"/>
                     <a:stretch>
                       <a:fillRect/>
                     </a:stretch>
@@ -2915,7 +3030,7 @@
                   <pic:spPr>
                     <a:xfrm>
                       <a:off x="0" y="0"/>
-                      <a:ext cx="5688000" cy="3150815"/>
+                      <a:ext cx="5688000" cy="3160353"/>
                     </a:xfrm>
                     <a:prstGeom prst="rect"/>
                   </pic:spPr>
@@ -3319,7 +3434,7 @@
       <w:r>
         <w:drawing>
           <wp:inline xmlns:a="http://schemas.openxmlformats.org/drawingml/2006/main" xmlns:pic="http://schemas.openxmlformats.org/drawingml/2006/picture">
-            <wp:extent cx="5688000" cy="1934840"/>
+            <wp:extent cx="5688000" cy="1938951"/>
             <wp:docPr id="5" name="Picture 5"/>
             <wp:cNvGraphicFramePr>
               <a:graphicFrameLocks noChangeAspect="1"/>
@@ -3332,7 +3447,7 @@
                     <pic:cNvPicPr/>
                   </pic:nvPicPr>
                   <pic:blipFill>
-                    <a:blip r:embed="rId14"/>
+                    <a:blip r:embed="rId25"/>
                     <a:stretch>
                       <a:fillRect/>
                     </a:stretch>
@@ -3340,7 +3455,7 @@
                   <pic:spPr>
                     <a:xfrm>
                       <a:off x="0" y="0"/>
-                      <a:ext cx="5688000" cy="1934840"/>
+                      <a:ext cx="5688000" cy="1938951"/>
                     </a:xfrm>
                     <a:prstGeom prst="rect"/>
                   </pic:spPr>
@@ -3398,7 +3513,7 @@
       <w:r>
         <w:drawing>
           <wp:inline xmlns:a="http://schemas.openxmlformats.org/drawingml/2006/main" xmlns:pic="http://schemas.openxmlformats.org/drawingml/2006/picture">
-            <wp:extent cx="5688000" cy="2865710"/>
+            <wp:extent cx="5688000" cy="2883078"/>
             <wp:docPr id="6" name="Picture 6"/>
             <wp:cNvGraphicFramePr>
               <a:graphicFrameLocks noChangeAspect="1"/>
@@ -3411,7 +3526,7 @@
                     <pic:cNvPicPr/>
                   </pic:nvPicPr>
                   <pic:blipFill>
-                    <a:blip r:embed="rId15"/>
+                    <a:blip r:embed="rId26"/>
                     <a:stretch>
                       <a:fillRect/>
                     </a:stretch>
@@ -3419,7 +3534,7 @@
                   <pic:spPr>
                     <a:xfrm>
                       <a:off x="0" y="0"/>
-                      <a:ext cx="5688000" cy="2865710"/>
+                      <a:ext cx="5688000" cy="2883078"/>
                     </a:xfrm>
                     <a:prstGeom prst="rect"/>
                   </pic:spPr>
@@ -3772,7 +3887,7 @@
       <w:r>
         <w:drawing>
           <wp:inline xmlns:a="http://schemas.openxmlformats.org/drawingml/2006/main" xmlns:pic="http://schemas.openxmlformats.org/drawingml/2006/picture">
-            <wp:extent cx="5688000" cy="2344068"/>
+            <wp:extent cx="5688000" cy="2346172"/>
             <wp:docPr id="7" name="Picture 7"/>
             <wp:cNvGraphicFramePr>
               <a:graphicFrameLocks noChangeAspect="1"/>
@@ -3785,7 +3900,7 @@
                     <pic:cNvPicPr/>
                   </pic:nvPicPr>
                   <pic:blipFill>
-                    <a:blip r:embed="rId16"/>
+                    <a:blip r:embed="rId27"/>
                     <a:stretch>
                       <a:fillRect/>
                     </a:stretch>
@@ -3793,7 +3908,7 @@
                   <pic:spPr>
                     <a:xfrm>
                       <a:off x="0" y="0"/>
-                      <a:ext cx="5688000" cy="2344068"/>
+                      <a:ext cx="5688000" cy="2346172"/>
                     </a:xfrm>
                     <a:prstGeom prst="rect"/>
                   </pic:spPr>
@@ -4328,7 +4443,7 @@
       <w:r>
         <w:drawing>
           <wp:inline xmlns:a="http://schemas.openxmlformats.org/drawingml/2006/main" xmlns:pic="http://schemas.openxmlformats.org/drawingml/2006/picture">
-            <wp:extent cx="5688000" cy="2515170"/>
+            <wp:extent cx="5688000" cy="2501817"/>
             <wp:docPr id="8" name="Picture 8"/>
             <wp:cNvGraphicFramePr>
               <a:graphicFrameLocks noChangeAspect="1"/>
@@ -4341,7 +4456,7 @@
                     <pic:cNvPicPr/>
                   </pic:nvPicPr>
                   <pic:blipFill>
-                    <a:blip r:embed="rId17"/>
+                    <a:blip r:embed="rId28"/>
                     <a:stretch>
                       <a:fillRect/>
                     </a:stretch>
@@ -4349,7 +4464,7 @@
                   <pic:spPr>
                     <a:xfrm>
                       <a:off x="0" y="0"/>
-                      <a:ext cx="5688000" cy="2515170"/>
+                      <a:ext cx="5688000" cy="2501817"/>
                     </a:xfrm>
                     <a:prstGeom prst="rect"/>
                   </pic:spPr>
@@ -4387,10 +4502,566 @@
     <w:p>
       <w:pPr>
         <w:pStyle w:val="Ttulo3"/>
+      </w:pPr>
+      <w:r>
+        <w:t>4.2.9 RQ09 — Colaboração e publicação de releases</w:t>
+      </w:r>
+    </w:p>
+    <w:p>
+      <w:pPr>
+        <w:jc w:val="both"/>
+      </w:pPr>
+      <w:r>
+        <w:t>Na amostra principal (idade ≥ 1 ano; n = 917), a correlação entre PRs mescladas/ano e releases/ano foi positiva forte (ρ = 0,6263). As medianas de releases/ano cresceram em todos os quartis, de 0,0000 no Q1 para 27,4182 no Q4.</w:t>
+      </w:r>
+    </w:p>
+    <w:tbl>
+      <w:tblPr>
+        <w:tblStyle w:val="Tabelacomgrade"/>
+        <w:tblW w:type="auto" w:w="0"/>
+        <w:jc w:val="center"/>
+        <w:tblLook w:firstColumn="1" w:firstRow="1" w:lastColumn="0" w:lastRow="0" w:noHBand="0" w:noVBand="1" w:val="04A0"/>
+      </w:tblPr>
+      <w:tblGrid>
+        <w:gridCol w:w="1881"/>
+        <w:gridCol w:w="1881"/>
+        <w:gridCol w:w="1881"/>
+        <w:gridCol w:w="1881"/>
+        <w:gridCol w:w="1881"/>
+      </w:tblGrid>
+      <w:tr>
+        <w:trPr>
+          <w:tblHeader/>
+        </w:trPr>
+        <w:tc>
+          <w:tcPr>
+            <w:tcW w:type="dxa" w:w="1881"/>
+            <w:shd w:fill="1F6E63"/>
+            <w:vAlign w:val="center"/>
+          </w:tcPr>
+          <w:p>
+            <w:pPr>
+              <w:jc w:val="center"/>
+            </w:pPr>
+            <w:r>
+              <w:rPr>
+                <w:b/>
+                <w:color w:val="FFFFFF"/>
+                <w:sz w:val="17"/>
+              </w:rPr>
+              <w:t>Faixa de PRs/ano</w:t>
+            </w:r>
+          </w:p>
+        </w:tc>
+        <w:tc>
+          <w:tcPr>
+            <w:tcW w:type="dxa" w:w="1881"/>
+            <w:shd w:fill="1F6E63"/>
+            <w:vAlign w:val="center"/>
+          </w:tcPr>
+          <w:p>
+            <w:pPr>
+              <w:jc w:val="center"/>
+            </w:pPr>
+            <w:r>
+              <w:rPr>
+                <w:b/>
+                <w:color w:val="FFFFFF"/>
+                <w:sz w:val="17"/>
+              </w:rPr>
+              <w:t>N</w:t>
+            </w:r>
+          </w:p>
+        </w:tc>
+        <w:tc>
+          <w:tcPr>
+            <w:tcW w:type="dxa" w:w="1881"/>
+            <w:shd w:fill="1F6E63"/>
+            <w:vAlign w:val="center"/>
+          </w:tcPr>
+          <w:p>
+            <w:pPr>
+              <w:jc w:val="center"/>
+            </w:pPr>
+            <w:r>
+              <w:rPr>
+                <w:b/>
+                <w:color w:val="FFFFFF"/>
+                <w:sz w:val="17"/>
+              </w:rPr>
+              <w:t>Limites de PRs/ano</w:t>
+            </w:r>
+          </w:p>
+        </w:tc>
+        <w:tc>
+          <w:tcPr>
+            <w:tcW w:type="dxa" w:w="1881"/>
+            <w:shd w:fill="1F6E63"/>
+            <w:vAlign w:val="center"/>
+          </w:tcPr>
+          <w:p>
+            <w:pPr>
+              <w:jc w:val="center"/>
+            </w:pPr>
+            <w:r>
+              <w:rPr>
+                <w:b/>
+                <w:color w:val="FFFFFF"/>
+                <w:sz w:val="17"/>
+              </w:rPr>
+              <w:t>Mediana PRs/ano</w:t>
+            </w:r>
+          </w:p>
+        </w:tc>
+        <w:tc>
+          <w:tcPr>
+            <w:tcW w:type="dxa" w:w="1881"/>
+            <w:shd w:fill="1F6E63"/>
+            <w:vAlign w:val="center"/>
+          </w:tcPr>
+          <w:p>
+            <w:pPr>
+              <w:jc w:val="center"/>
+            </w:pPr>
+            <w:r>
+              <w:rPr>
+                <w:b/>
+                <w:color w:val="FFFFFF"/>
+                <w:sz w:val="17"/>
+              </w:rPr>
+              <w:t>Mediana releases/ano</w:t>
+            </w:r>
+          </w:p>
+        </w:tc>
+      </w:tr>
+      <w:tr>
+        <w:tc>
+          <w:tcPr>
+            <w:tcW w:type="dxa" w:w="1881"/>
+            <w:vAlign w:val="center"/>
+          </w:tcPr>
+          <w:p>
+            <w:pPr>
+              <w:jc w:val="left"/>
+            </w:pPr>
+            <w:r>
+              <w:rPr>
+                <w:sz w:val="17"/>
+              </w:rPr>
+              <w:t>Q1 — menor intensidade</w:t>
+            </w:r>
+          </w:p>
+        </w:tc>
+        <w:tc>
+          <w:tcPr>
+            <w:tcW w:type="dxa" w:w="1881"/>
+            <w:vAlign w:val="center"/>
+          </w:tcPr>
+          <w:p>
+            <w:pPr>
+              <w:jc w:val="center"/>
+            </w:pPr>
+            <w:r>
+              <w:rPr>
+                <w:sz w:val="17"/>
+              </w:rPr>
+              <w:t>230</w:t>
+            </w:r>
+          </w:p>
+        </w:tc>
+        <w:tc>
+          <w:tcPr>
+            <w:tcW w:type="dxa" w:w="1881"/>
+            <w:vAlign w:val="center"/>
+          </w:tcPr>
+          <w:p>
+            <w:pPr>
+              <w:jc w:val="center"/>
+            </w:pPr>
+            <w:r>
+              <w:rPr>
+                <w:sz w:val="17"/>
+              </w:rPr>
+              <w:t>0,0000–26,1601</w:t>
+            </w:r>
+          </w:p>
+        </w:tc>
+        <w:tc>
+          <w:tcPr>
+            <w:tcW w:type="dxa" w:w="1881"/>
+            <w:vAlign w:val="center"/>
+          </w:tcPr>
+          <w:p>
+            <w:pPr>
+              <w:jc w:val="center"/>
+            </w:pPr>
+            <w:r>
+              <w:rPr>
+                <w:sz w:val="17"/>
+              </w:rPr>
+              <w:t>8,2430</w:t>
+            </w:r>
+          </w:p>
+        </w:tc>
+        <w:tc>
+          <w:tcPr>
+            <w:tcW w:type="dxa" w:w="1881"/>
+            <w:vAlign w:val="center"/>
+          </w:tcPr>
+          <w:p>
+            <w:pPr>
+              <w:jc w:val="center"/>
+            </w:pPr>
+            <w:r>
+              <w:rPr>
+                <w:sz w:val="17"/>
+              </w:rPr>
+              <w:t>0,0000</w:t>
+            </w:r>
+          </w:p>
+        </w:tc>
+      </w:tr>
+      <w:tr>
+        <w:tc>
+          <w:tcPr>
+            <w:tcW w:type="dxa" w:w="1881"/>
+            <w:vAlign w:val="center"/>
+          </w:tcPr>
+          <w:p>
+            <w:pPr>
+              <w:jc w:val="left"/>
+            </w:pPr>
+            <w:r>
+              <w:rPr>
+                <w:sz w:val="17"/>
+              </w:rPr>
+              <w:t>Q2</w:t>
+            </w:r>
+          </w:p>
+        </w:tc>
+        <w:tc>
+          <w:tcPr>
+            <w:tcW w:type="dxa" w:w="1881"/>
+            <w:vAlign w:val="center"/>
+          </w:tcPr>
+          <w:p>
+            <w:pPr>
+              <w:jc w:val="center"/>
+            </w:pPr>
+            <w:r>
+              <w:rPr>
+                <w:sz w:val="17"/>
+              </w:rPr>
+              <w:t>229</w:t>
+            </w:r>
+          </w:p>
+        </w:tc>
+        <w:tc>
+          <w:tcPr>
+            <w:tcW w:type="dxa" w:w="1881"/>
+            <w:vAlign w:val="center"/>
+          </w:tcPr>
+          <w:p>
+            <w:pPr>
+              <w:jc w:val="center"/>
+            </w:pPr>
+            <w:r>
+              <w:rPr>
+                <w:sz w:val="17"/>
+              </w:rPr>
+              <w:t>26,5625–115,5732</w:t>
+            </w:r>
+          </w:p>
+        </w:tc>
+        <w:tc>
+          <w:tcPr>
+            <w:tcW w:type="dxa" w:w="1881"/>
+            <w:vAlign w:val="center"/>
+          </w:tcPr>
+          <w:p>
+            <w:pPr>
+              <w:jc w:val="center"/>
+            </w:pPr>
+            <w:r>
+              <w:rPr>
+                <w:sz w:val="17"/>
+              </w:rPr>
+              <w:t>58,7389</w:t>
+            </w:r>
+          </w:p>
+        </w:tc>
+        <w:tc>
+          <w:tcPr>
+            <w:tcW w:type="dxa" w:w="1881"/>
+            <w:vAlign w:val="center"/>
+          </w:tcPr>
+          <w:p>
+            <w:pPr>
+              <w:jc w:val="center"/>
+            </w:pPr>
+            <w:r>
+              <w:rPr>
+                <w:sz w:val="17"/>
+              </w:rPr>
+              <w:t>3,1111</w:t>
+            </w:r>
+          </w:p>
+        </w:tc>
+      </w:tr>
+      <w:tr>
+        <w:tc>
+          <w:tcPr>
+            <w:tcW w:type="dxa" w:w="1881"/>
+            <w:vAlign w:val="center"/>
+          </w:tcPr>
+          <w:p>
+            <w:pPr>
+              <w:jc w:val="left"/>
+            </w:pPr>
+            <w:r>
+              <w:rPr>
+                <w:sz w:val="17"/>
+              </w:rPr>
+              <w:t>Q3</w:t>
+            </w:r>
+          </w:p>
+        </w:tc>
+        <w:tc>
+          <w:tcPr>
+            <w:tcW w:type="dxa" w:w="1881"/>
+            <w:vAlign w:val="center"/>
+          </w:tcPr>
+          <w:p>
+            <w:pPr>
+              <w:jc w:val="center"/>
+            </w:pPr>
+            <w:r>
+              <w:rPr>
+                <w:sz w:val="17"/>
+              </w:rPr>
+              <w:t>229</w:t>
+            </w:r>
+          </w:p>
+        </w:tc>
+        <w:tc>
+          <w:tcPr>
+            <w:tcW w:type="dxa" w:w="1881"/>
+            <w:vAlign w:val="center"/>
+          </w:tcPr>
+          <w:p>
+            <w:pPr>
+              <w:jc w:val="center"/>
+            </w:pPr>
+            <w:r>
+              <w:rPr>
+                <w:sz w:val="17"/>
+              </w:rPr>
+              <w:t>116,1959–554,4073</w:t>
+            </w:r>
+          </w:p>
+        </w:tc>
+        <w:tc>
+          <w:tcPr>
+            <w:tcW w:type="dxa" w:w="1881"/>
+            <w:vAlign w:val="center"/>
+          </w:tcPr>
+          <w:p>
+            <w:pPr>
+              <w:jc w:val="center"/>
+            </w:pPr>
+            <w:r>
+              <w:rPr>
+                <w:sz w:val="17"/>
+              </w:rPr>
+              <w:t>266,0714</w:t>
+            </w:r>
+          </w:p>
+        </w:tc>
+        <w:tc>
+          <w:tcPr>
+            <w:tcW w:type="dxa" w:w="1881"/>
+            <w:vAlign w:val="center"/>
+          </w:tcPr>
+          <w:p>
+            <w:pPr>
+              <w:jc w:val="center"/>
+            </w:pPr>
+            <w:r>
+              <w:rPr>
+                <w:sz w:val="17"/>
+              </w:rPr>
+              <w:t>11,7057</w:t>
+            </w:r>
+          </w:p>
+        </w:tc>
+      </w:tr>
+      <w:tr>
+        <w:tc>
+          <w:tcPr>
+            <w:tcW w:type="dxa" w:w="1881"/>
+            <w:vAlign w:val="center"/>
+          </w:tcPr>
+          <w:p>
+            <w:pPr>
+              <w:jc w:val="left"/>
+            </w:pPr>
+            <w:r>
+              <w:rPr>
+                <w:sz w:val="17"/>
+              </w:rPr>
+              <w:t>Q4 — maior intensidade</w:t>
+            </w:r>
+          </w:p>
+        </w:tc>
+        <w:tc>
+          <w:tcPr>
+            <w:tcW w:type="dxa" w:w="1881"/>
+            <w:vAlign w:val="center"/>
+          </w:tcPr>
+          <w:p>
+            <w:pPr>
+              <w:jc w:val="center"/>
+            </w:pPr>
+            <w:r>
+              <w:rPr>
+                <w:sz w:val="17"/>
+              </w:rPr>
+              <w:t>229</w:t>
+            </w:r>
+          </w:p>
+        </w:tc>
+        <w:tc>
+          <w:tcPr>
+            <w:tcW w:type="dxa" w:w="1881"/>
+            <w:vAlign w:val="center"/>
+          </w:tcPr>
+          <w:p>
+            <w:pPr>
+              <w:jc w:val="center"/>
+            </w:pPr>
+            <w:r>
+              <w:rPr>
+                <w:sz w:val="17"/>
+              </w:rPr>
+              <w:t>554,9703–10.831,1927</w:t>
+            </w:r>
+          </w:p>
+        </w:tc>
+        <w:tc>
+          <w:tcPr>
+            <w:tcW w:type="dxa" w:w="1881"/>
+            <w:vAlign w:val="center"/>
+          </w:tcPr>
+          <w:p>
+            <w:pPr>
+              <w:jc w:val="center"/>
+            </w:pPr>
+            <w:r>
+              <w:rPr>
+                <w:sz w:val="17"/>
+              </w:rPr>
+              <w:t>1.311,2195</w:t>
+            </w:r>
+          </w:p>
+        </w:tc>
+        <w:tc>
+          <w:tcPr>
+            <w:tcW w:type="dxa" w:w="1881"/>
+            <w:vAlign w:val="center"/>
+          </w:tcPr>
+          <w:p>
+            <w:pPr>
+              <w:jc w:val="center"/>
+            </w:pPr>
+            <w:r>
+              <w:rPr>
+                <w:sz w:val="17"/>
+              </w:rPr>
+              <w:t>27,4182</w:t>
+            </w:r>
+          </w:p>
+        </w:tc>
+      </w:tr>
+    </w:tbl>
+    <w:p/>
+    <w:p>
+      <w:pPr>
+        <w:jc w:val="both"/>
+      </w:pPr>
+      <w:r>
+        <w:t>O critério de 1,5 × IQR identificou 112 extremos em PRs/ano, 92 em releases/ano e 165 repositórios na união; 39 foram extremos nas duas taxas. Todos foram mantidos.</w:t>
+      </w:r>
+    </w:p>
+    <w:p>
+      <w:pPr>
+        <w:jc w:val="center"/>
+      </w:pPr>
+      <w:r>
+        <w:drawing>
+          <wp:inline xmlns:a="http://schemas.openxmlformats.org/drawingml/2006/main" xmlns:pic="http://schemas.openxmlformats.org/drawingml/2006/picture">
+            <wp:extent cx="5688000" cy="3200032"/>
+            <wp:docPr id="9" name="Picture 9"/>
+            <wp:cNvGraphicFramePr>
+              <a:graphicFrameLocks noChangeAspect="1"/>
+            </wp:cNvGraphicFramePr>
+            <a:graphic>
+              <a:graphicData uri="http://schemas.openxmlformats.org/drawingml/2006/picture">
+                <pic:pic>
+                  <pic:nvPicPr>
+                    <pic:cNvPr id="0" name="rq09.png"/>
+                    <pic:cNvPicPr/>
+                  </pic:nvPicPr>
+                  <pic:blipFill>
+                    <a:blip r:embed="rId29"/>
+                    <a:stretch>
+                      <a:fillRect/>
+                    </a:stretch>
+                  </pic:blipFill>
+                  <pic:spPr>
+                    <a:xfrm>
+                      <a:off x="0" y="0"/>
+                      <a:ext cx="5688000" cy="3200032"/>
+                    </a:xfrm>
+                    <a:prstGeom prst="rect"/>
+                  </pic:spPr>
+                </pic:pic>
+              </a:graphicData>
+            </a:graphic>
+          </wp:inline>
+        </w:drawing>
+      </w:r>
+    </w:p>
+    <w:p>
+      <w:pPr>
+        <w:jc w:val="center"/>
+      </w:pPr>
+      <w:r>
+        <w:rPr>
+          <w:b/>
+          <w:sz w:val="19"/>
+        </w:rPr>
+        <w:t>Figura 10 — Dispersão de PRs/ano versus releases/ano, com outliers e linha de tendência.</w:t>
+      </w:r>
+    </w:p>
+    <w:p>
+      <w:pPr>
+        <w:jc w:val="center"/>
+      </w:pPr>
+      <w:r>
+        <w:rPr>
+          <w:i/>
+          <w:sz w:val="17"/>
+        </w:rPr>
+        <w:t>Fonte: elaborado pelo grupo com dados da API GraphQL do GitHub, 2026.</w:t>
+      </w:r>
+    </w:p>
+    <w:p>
+      <w:pPr>
+        <w:pStyle w:val="Ttulo3"/>
         <w:pageBreakBefore/>
       </w:pPr>
       <w:r>
-        <w:t>4.2.9 RQ10 — Maturidade e tratamento de issues</w:t>
+        <w:t>4.2.10 RQ10 — Maturidade e tratamento de issues</w:t>
       </w:r>
     </w:p>
     <w:p>
@@ -5086,8 +5757,8 @@
       <w:r>
         <w:drawing>
           <wp:inline xmlns:a="http://schemas.openxmlformats.org/drawingml/2006/main" xmlns:pic="http://schemas.openxmlformats.org/drawingml/2006/picture">
-            <wp:extent cx="5688000" cy="2577606"/>
-            <wp:docPr id="9" name="Picture 9"/>
+            <wp:extent cx="5688000" cy="2581420"/>
+            <wp:docPr id="10" name="Picture 10"/>
             <wp:cNvGraphicFramePr>
               <a:graphicFrameLocks noChangeAspect="1"/>
             </wp:cNvGraphicFramePr>
@@ -5099,7 +5770,7 @@
                     <pic:cNvPicPr/>
                   </pic:nvPicPr>
                   <pic:blipFill>
-                    <a:blip r:embed="rId18"/>
+                    <a:blip r:embed="rId30"/>
                     <a:stretch>
                       <a:fillRect/>
                     </a:stretch>
@@ -5107,7 +5778,7 @@
                   <pic:spPr>
                     <a:xfrm>
                       <a:off x="0" y="0"/>
-                      <a:ext cx="5688000" cy="2577606"/>
+                      <a:ext cx="5688000" cy="2581420"/>
                     </a:xfrm>
                     <a:prstGeom prst="rect"/>
                   </pic:spPr>
@@ -5127,7 +5798,7 @@
           <w:b/>
           <w:sz w:val="19"/>
         </w:rPr>
-        <w:t>Figura 10 — Relação entre idade e percentual de issues fechadas, com medianas e IQR por faixa etária.</w:t>
+        <w:t>Figura 11 — Relação entre idade e percentual de issues fechadas, com medianas e IQR por faixa etária.</w:t>
       </w:r>
     </w:p>
     <w:p>
@@ -5283,7 +5954,23 @@
         <w:pStyle w:val="Ttulo3"/>
       </w:pPr>
       <w:r>
-        <w:t>4.3.9 RQ10</w:t>
+        <w:t>4.3.9 RQ09</w:t>
+      </w:r>
+    </w:p>
+    <w:p>
+      <w:pPr>
+        <w:jc w:val="both"/>
+      </w:pPr>
+      <w:r>
+        <w:t>A H09 recebeu apoio descritivo: a associação foi positiva forte (ρ = 0,6263) e as medianas de releases/ano cresceram ao longo dos quartis de PRs/ano. O desenho transversal não demonstra que elevar a colaboração cause mais releases.</w:t>
+      </w:r>
+    </w:p>
+    <w:p>
+      <w:pPr>
+        <w:pStyle w:val="Ttulo3"/>
+      </w:pPr>
+      <w:r>
+        <w:t>4.3.10 RQ10</w:t>
       </w:r>
     </w:p>
     <w:p>
@@ -5652,6 +6339,42 @@
               <w:rPr>
                 <w:sz w:val="17"/>
               </w:rPr>
+              <w:t>H09</w:t>
+            </w:r>
+          </w:p>
+        </w:tc>
+        <w:tc>
+          <w:tcPr>
+            <w:tcW w:type="dxa" w:w="4703"/>
+            <w:vAlign w:val="center"/>
+          </w:tcPr>
+          <w:p>
+            <w:pPr>
+              <w:jc w:val="center"/>
+            </w:pPr>
+            <w:r>
+              <w:rPr>
+                <w:sz w:val="17"/>
+              </w:rPr>
+              <w:t>Compatível descritivamente</w:t>
+            </w:r>
+          </w:p>
+        </w:tc>
+      </w:tr>
+      <w:tr>
+        <w:tc>
+          <w:tcPr>
+            <w:tcW w:type="dxa" w:w="4703"/>
+            <w:vAlign w:val="center"/>
+          </w:tcPr>
+          <w:p>
+            <w:pPr>
+              <w:jc w:val="left"/>
+            </w:pPr>
+            <w:r>
+              <w:rPr>
+                <w:sz w:val="17"/>
+              </w:rPr>
               <w:t>H10</w:t>
             </w:r>
           </w:p>
@@ -5681,7 +6404,7 @@
         <w:pStyle w:val="Ttulo3"/>
       </w:pPr>
       <w:r>
-        <w:t>4.3.10 Ameaças à validade</w:t>
+        <w:t>4.3.11 Ameaças à validade</w:t>
       </w:r>
     </w:p>
     <w:p>
@@ -5709,7 +6432,7 @@
         <w:t>Anualização.</w:t>
       </w:r>
       <w:r>
-        <w:t xml:space="preserve"> Dividir acumulados pela idade supõe uma taxa média constante e amplifica valores de projetos muito jovens. Por isso, a análise principal exige um ano e a sensibilidade inclui todas as idades positivas.</w:t>
+        <w:t xml:space="preserve"> Dividir acumulados pela idade supõe uma taxa média constante e amplifica valores de projetos muito jovens. Como PRs/ano e releases/ano usam a mesma idade como denominador, parte da associação pode refletir esse fator comum. Por isso, a análise principal exige ao menos um ano.</w:t>
       </w:r>
     </w:p>
     <w:p>
@@ -5795,7 +6518,7 @@
         <w:jc w:val="both"/>
       </w:pPr>
       <w:r>
-        <w:t>A coleta oficial reuniu 1.000 repositórios únicos, ordenados por estrelas, e gerou CSV e nove JSONs coerentes para RQ01–RQ08 e RQ10. Todos os valores do relatório foram recalculados do mesmo snapshot, reduzindo o risco de divergência entre dados, texto, tabelas e gráficos.</w:t>
+        <w:t>A coleta oficial reuniu 1.000 repositórios únicos, ordenados por estrelas, e gerou CSV e dez JSONs coerentes para RQ01–RQ10. Todos os valores do relatório foram recalculados do mesmo snapshot, reduzindo o risco de divergência entre dados, texto, tabelas e gráficos.</w:t>
       </w:r>
     </w:p>
     <w:p>
@@ -5811,6 +6534,14 @@
         <w:jc w:val="both"/>
       </w:pPr>
       <w:r>
+        <w:t>A RQ09 respondeu positivamente à pergunta de pesquisa: PRs mescladas/ano e releases/ano apresentaram associação positiva forte (ρ = 0,6263), acompanhada pelo crescimento das medianas de releases/ano entre Q1 e Q4. A evidência é associativa e não causal.</w:t>
+      </w:r>
+    </w:p>
+    <w:p>
+      <w:pPr>
+        <w:jc w:val="both"/>
+      </w:pPr>
+      <w:r>
         <w:t>Na RQ10, as medianas de issues fechadas aumentaram de 79,55% para 95,40% entre as faixas extremas, mas a correlação foi positiva fraca (ρ = 0,2323). A H10 recebeu apoio descritivo parcial, sem evidência de que a idade cause maior capacidade de fechamento.</w:t>
       </w:r>
     </w:p>
@@ -5819,7 +6550,7 @@
         <w:jc w:val="both"/>
       </w:pPr>
       <w:r>
-        <w:t>O Streamlit comunica a RQ08 e a RQ10 junto às questões anteriores, oferece busca por repositório e download do CSV. Esta versão é intermediária: RQ09, revisão final do texto e anexo com o print do board e a política de WIP ainda devem ser concluídos antes do Relatório Final.</w:t>
+        <w:t>O Streamlit comunica as RQ01–RQ10, oferece busca por repositório e download do CSV. Esta versão permanece intermediária somente quanto à evidência final do processo: o anexo com o print do fluxo completo do grupo no GitHub Project/Kanban deve ser preenchido após a conclusão de todo o trabalho.</w:t>
       </w:r>
     </w:p>
     <w:p>
@@ -5900,7 +6631,7 @@
         <w:jc w:val="both"/>
       </w:pPr>
       <w:r>
-        <w:t>PENDÊNCIA DA VERSÃO INTERMEDIÁRIA: inserir no Relatório Final o print do board mostrando o fluxo completo de S01 a S03 e a política de WIP em uso. O primeiro snapshot da S02 permanece preservado no histórico do projeto.</w:t>
+        <w:t>PENDÊNCIA DA ISSUE #48: capturar somente ao final do trabalho o GitHub Project/Kanban mostrando o fluxo completo do grupo. O estado atual não substitui a captura final.</w:t>
       </w:r>
     </w:p>
     <w:tbl>
@@ -5927,15 +6658,15 @@
               <w:rPr>
                 <w:b/>
               </w:rPr>
-              <w:t>INSERIR SNAPSHOT FINAL DO BOARD E EVIDÊNCIA DA POLÍTICA DE WIP</w:t>
+              <w:t>CAPTURAR AO FINAL: SNAPSHOT DO BOARD COM O FLUXO COMPLETO DO GRUPO</w:t>
             </w:r>
           </w:p>
         </w:tc>
       </w:tr>
     </w:tbl>
     <w:sectPr>
-      <w:headerReference w:type="default" r:id="rId8"/>
-      <w:footerReference w:type="default" r:id="rId9"/>
+      <w:headerReference w:type="default" r:id="rId19"/>
+      <w:footerReference w:type="default" r:id="rId20"/>
       <w:pgSz w:w="12240" w:h="15840"/>
       <w:pgMar w:top="1134" w:right="1417" w:bottom="1134" w:left="1417" w:header="720" w:footer="720" w:gutter="0"/>
       <w:cols w:space="720"/>
@@ -5962,6 +6693,23 @@
 </w:ftr>
 </file>
 
+<file path=word/footer2.xml><?xml version="1.0" encoding="utf-8"?>
+<w:ftr xmlns:m="http://schemas.openxmlformats.org/officeDocument/2006/math" xmlns:mc="http://schemas.openxmlformats.org/markup-compatibility/2006" xmlns:mo="http://schemas.microsoft.com/office/mac/office/2008/main" xmlns:mv="urn:schemas-microsoft-com:mac:vml" xmlns:o="urn:schemas-microsoft-com:office:office" xmlns:r="http://schemas.openxmlformats.org/officeDocument/2006/relationships" xmlns:v="urn:schemas-microsoft-com:vml" xmlns:w10="urn:schemas-microsoft-com:office:word" xmlns:w14="http://schemas.microsoft.com/office/word/2010/wordml" xmlns:w="http://schemas.openxmlformats.org/wordprocessingml/2006/main" xmlns:wne="http://schemas.microsoft.com/office/word/2006/wordml" xmlns:wp14="http://schemas.microsoft.com/office/word/2010/wordprocessingDrawing" xmlns:wp="http://schemas.openxmlformats.org/drawingml/2006/wordprocessingDrawing" xmlns:wpc="http://schemas.microsoft.com/office/word/2010/wordprocessingCanvas" xmlns:wpg="http://schemas.microsoft.com/office/word/2010/wordprocessingGroup" xmlns:wpi="http://schemas.microsoft.com/office/word/2010/wordprocessingInk" xmlns:wps="http://schemas.microsoft.com/office/word/2010/wordprocessingShape" mc:Ignorable="w14 wp14">
+  <w:p>
+    <w:pPr>
+      <w:pStyle w:val="Footer"/>
+      <w:jc w:val="center"/>
+    </w:pPr>
+    <w:r>
+      <w:t xml:space="preserve">Página </w:t>
+      <w:fldChar w:fldCharType="begin"/>
+      <w:instrText xml:space="preserve"> PAGE </w:instrText>
+      <w:fldChar w:fldCharType="end"/>
+    </w:r>
+  </w:p>
+</w:ftr>
+</file>
+
 <file path=word/header1.xml><?xml version="1.0" encoding="utf-8"?>
 <w:hdr xmlns:m="http://schemas.openxmlformats.org/officeDocument/2006/math" xmlns:mc="http://schemas.openxmlformats.org/markup-compatibility/2006" xmlns:mo="http://schemas.microsoft.com/office/mac/office/2008/main" xmlns:mv="urn:schemas-microsoft-com:mac:vml" xmlns:o="urn:schemas-microsoft-com:office:office" xmlns:r="http://schemas.openxmlformats.org/officeDocument/2006/relationships" xmlns:v="urn:schemas-microsoft-com:vml" xmlns:w10="urn:schemas-microsoft-com:office:word" xmlns:w14="http://schemas.microsoft.com/office/word/2010/wordml" xmlns:w="http://schemas.openxmlformats.org/wordprocessingml/2006/main" xmlns:wne="http://schemas.microsoft.com/office/word/2006/wordml" xmlns:wp14="http://schemas.microsoft.com/office/word/2010/wordprocessingDrawing" xmlns:wp="http://schemas.openxmlformats.org/drawingml/2006/wordprocessingDrawing" xmlns:wpc="http://schemas.microsoft.com/office/word/2010/wordprocessingCanvas" xmlns:wpg="http://schemas.microsoft.com/office/word/2010/wordprocessingGroup" xmlns:wpi="http://schemas.microsoft.com/office/word/2010/wordprocessingInk" xmlns:wps="http://schemas.microsoft.com/office/word/2010/wordprocessingShape" mc:Ignorable="w14 wp14">
   <w:p>
@@ -5974,6 +6722,23 @@
         <w:sz w:val="17"/>
       </w:rPr>
       <w:t>Laboratório de Experimentação de Software — Lab01S03 — RQ01–RQ08 e RQ10</w:t>
+    </w:r>
+  </w:p>
+</w:hdr>
+</file>
+
+<file path=word/header2.xml><?xml version="1.0" encoding="utf-8"?>
+<w:hdr xmlns:m="http://schemas.openxmlformats.org/officeDocument/2006/math" xmlns:mc="http://schemas.openxmlformats.org/markup-compatibility/2006" xmlns:mo="http://schemas.microsoft.com/office/mac/office/2008/main" xmlns:mv="urn:schemas-microsoft-com:mac:vml" xmlns:o="urn:schemas-microsoft-com:office:office" xmlns:r="http://schemas.openxmlformats.org/officeDocument/2006/relationships" xmlns:v="urn:schemas-microsoft-com:vml" xmlns:w10="urn:schemas-microsoft-com:office:word" xmlns:w14="http://schemas.microsoft.com/office/word/2010/wordml" xmlns:w="http://schemas.openxmlformats.org/wordprocessingml/2006/main" xmlns:wne="http://schemas.microsoft.com/office/word/2006/wordml" xmlns:wp14="http://schemas.microsoft.com/office/word/2010/wordprocessingDrawing" xmlns:wp="http://schemas.openxmlformats.org/drawingml/2006/wordprocessingDrawing" xmlns:wpc="http://schemas.microsoft.com/office/word/2010/wordprocessingCanvas" xmlns:wpg="http://schemas.microsoft.com/office/word/2010/wordprocessingGroup" xmlns:wpi="http://schemas.microsoft.com/office/word/2010/wordprocessingInk" xmlns:wps="http://schemas.microsoft.com/office/word/2010/wordprocessingShape" mc:Ignorable="w14 wp14">
+  <w:p>
+    <w:pPr>
+      <w:pStyle w:val="Header"/>
+      <w:jc w:val="center"/>
+    </w:pPr>
+    <w:r>
+      <w:rPr>
+        <w:sz w:val="17"/>
+      </w:rPr>
+      <w:t>Laboratório de Experimentação de Software — Lab01S03 — RQ01–RQ10</w:t>
     </w:r>
   </w:p>
 </w:hdr>

</xml_diff>